<commit_message>
Reorganize references around the persuasion framework
Restructure the literature list by thesis chapter (2.1-2.4 and 3.4
measures), add a reading order, and add PMT meta-analysis and scale
sources (Floyd et al. 2000, Johnston & Warkentin 2010, Boss et al. 2015,
Witte et al. 1996). Link the scale sources from the research design.

Co-Authored-By: Claude Opus 5.5 <noreply@anthropic.com>
Claude-Session: https://claude.ai/code/session_01WSodRD9WsTbeEeKbp2Zxog
</commit_message>
<xml_diff>
--- a/notes/thesis-outline.docx
+++ b/notes/thesis-outline.docx
@@ -5163,10 +5163,10 @@
         <w:ind w:left="360" w:hanging="300"/>
       </w:pPr>
       <w:r>
-        <w:t xml:space="preserve">☐ </w:t>
-      </w:r>
-      <w:r>
-        <w:t xml:space="preserve">보호 동기 이론 변수(위협, 효능감)의 측정 척도 찾기</w:t>
+        <w:t xml:space="preserve">☑ </w:t>
+      </w:r>
+      <w:r>
+        <w:t xml:space="preserve">보호 동기 이론 변수(위협, 효능감)의 측정 척도 찾기 → literature-review.md 3.4절</w:t>
       </w:r>
     </w:p>
     <w:p>

</xml_diff>